<commit_message>
Update document generation routes and localize application strings
Replit-Commit-Author: Agent
</commit_message>
<xml_diff>
--- a/artifacts/bewerbungski/public/downloads/Max_Mustermann_Anschreiben.docx
+++ b/artifacts/bewerbungski/public/downloads/Max_Mustermann_Anschreiben.docx
@@ -4,15 +4,15 @@
   <w:body>
     <w:p>
       <w:pPr>
-        <w:spacing w:after="80"/>
+        <w:spacing w:after="60"/>
         <w:jc w:val="center"/>
       </w:pPr>
       <w:r>
         <w:rPr>
-          <w:rFonts w:ascii="Helvetica" w:cs="Helvetica" w:eastAsia="Helvetica" w:hAnsi="Helvetica"/>
+          <w:rFonts w:ascii="Calibri" w:cs="Calibri" w:eastAsia="Calibri" w:hAnsi="Calibri"/>
           <w:b/>
           <w:bCs/>
-          <w:spacing w:val="60"/>
+          <w:spacing w:val="40"/>
           <w:sz w:val="32"/>
           <w:szCs w:val="32"/>
         </w:rPr>
@@ -22,24 +22,24 @@
     <w:p>
       <w:pPr>
         <w:pBdr>
-          <w:bottom w:val="single" w:color="1F2937" w:sz="6"/>
+          <w:bottom w:val="single" w:color="1F2937" w:sz="8"/>
         </w:pBdr>
         <w:spacing w:after="160" w:before="160"/>
       </w:pPr>
     </w:p>
     <w:p>
       <w:pPr>
-        <w:spacing w:after="200"/>
-      </w:pPr>
-    </w:p>
-    <w:p>
-      <w:pPr>
-        <w:spacing w:after="120"/>
-        <w:jc w:val="left"/>
-      </w:pPr>
-      <w:r>
-        <w:rPr>
-          <w:rFonts w:ascii="Helvetica" w:cs="Helvetica" w:eastAsia="Helvetica" w:hAnsi="Helvetica"/>
+        <w:spacing w:after="160"/>
+      </w:pPr>
+    </w:p>
+    <w:p>
+      <w:pPr>
+        <w:spacing w:after="110"/>
+        <w:jc w:val="left"/>
+      </w:pPr>
+      <w:r>
+        <w:rPr>
+          <w:rFonts w:ascii="Calibri" w:cs="Calibri" w:eastAsia="Calibri" w:hAnsi="Calibri"/>
           <w:sz w:val="22"/>
           <w:szCs w:val="22"/>
         </w:rPr>
@@ -48,12 +48,12 @@
     </w:p>
     <w:p>
       <w:pPr>
-        <w:spacing w:after="120"/>
-        <w:jc w:val="left"/>
-      </w:pPr>
-      <w:r>
-        <w:rPr>
-          <w:rFonts w:ascii="Helvetica" w:cs="Helvetica" w:eastAsia="Helvetica" w:hAnsi="Helvetica"/>
+        <w:spacing w:after="110"/>
+        <w:jc w:val="left"/>
+      </w:pPr>
+      <w:r>
+        <w:rPr>
+          <w:rFonts w:ascii="Calibri" w:cs="Calibri" w:eastAsia="Calibri" w:hAnsi="Calibri"/>
           <w:sz w:val="22"/>
           <w:szCs w:val="22"/>
         </w:rPr>
@@ -62,12 +62,12 @@
     </w:p>
     <w:p>
       <w:pPr>
-        <w:spacing w:after="120"/>
-        <w:jc w:val="left"/>
-      </w:pPr>
-      <w:r>
-        <w:rPr>
-          <w:rFonts w:ascii="Helvetica" w:cs="Helvetica" w:eastAsia="Helvetica" w:hAnsi="Helvetica"/>
+        <w:spacing w:after="110"/>
+        <w:jc w:val="left"/>
+      </w:pPr>
+      <w:r>
+        <w:rPr>
+          <w:rFonts w:ascii="Calibri" w:cs="Calibri" w:eastAsia="Calibri" w:hAnsi="Calibri"/>
           <w:sz w:val="22"/>
           <w:szCs w:val="22"/>
         </w:rPr>
@@ -81,21 +81,21 @@
       </w:pPr>
       <w:r>
         <w:rPr>
-          <w:rFonts w:ascii="Helvetica" w:cs="Helvetica" w:eastAsia="Helvetica" w:hAnsi="Helvetica"/>
-          <w:sz w:val="22"/>
-          <w:szCs w:val="22"/>
-        </w:rPr>
-        <w:t xml:space="preserve"/>
-      </w:r>
-    </w:p>
-    <w:p>
-      <w:pPr>
-        <w:spacing w:after="120"/>
-        <w:jc w:val="left"/>
-      </w:pPr>
-      <w:r>
-        <w:rPr>
-          <w:rFonts w:ascii="Helvetica" w:cs="Helvetica" w:eastAsia="Helvetica" w:hAnsi="Helvetica"/>
+          <w:rFonts w:ascii="Calibri" w:cs="Calibri" w:eastAsia="Calibri" w:hAnsi="Calibri"/>
+          <w:sz w:val="22"/>
+          <w:szCs w:val="22"/>
+        </w:rPr>
+        <w:t xml:space="preserve"/>
+      </w:r>
+    </w:p>
+    <w:p>
+      <w:pPr>
+        <w:spacing w:after="110"/>
+        <w:jc w:val="left"/>
+      </w:pPr>
+      <w:r>
+        <w:rPr>
+          <w:rFonts w:ascii="Calibri" w:cs="Calibri" w:eastAsia="Calibri" w:hAnsi="Calibri"/>
           <w:sz w:val="22"/>
           <w:szCs w:val="22"/>
         </w:rPr>
@@ -104,12 +104,12 @@
     </w:p>
     <w:p>
       <w:pPr>
-        <w:spacing w:after="120"/>
-        <w:jc w:val="left"/>
-      </w:pPr>
-      <w:r>
-        <w:rPr>
-          <w:rFonts w:ascii="Helvetica" w:cs="Helvetica" w:eastAsia="Helvetica" w:hAnsi="Helvetica"/>
+        <w:spacing w:after="110"/>
+        <w:jc w:val="left"/>
+      </w:pPr>
+      <w:r>
+        <w:rPr>
+          <w:rFonts w:ascii="Calibri" w:cs="Calibri" w:eastAsia="Calibri" w:hAnsi="Calibri"/>
           <w:sz w:val="22"/>
           <w:szCs w:val="22"/>
         </w:rPr>
@@ -118,12 +118,12 @@
     </w:p>
     <w:p>
       <w:pPr>
-        <w:spacing w:after="120"/>
-        <w:jc w:val="left"/>
-      </w:pPr>
-      <w:r>
-        <w:rPr>
-          <w:rFonts w:ascii="Helvetica" w:cs="Helvetica" w:eastAsia="Helvetica" w:hAnsi="Helvetica"/>
+        <w:spacing w:after="110"/>
+        <w:jc w:val="left"/>
+      </w:pPr>
+      <w:r>
+        <w:rPr>
+          <w:rFonts w:ascii="Calibri" w:cs="Calibri" w:eastAsia="Calibri" w:hAnsi="Calibri"/>
           <w:sz w:val="22"/>
           <w:szCs w:val="22"/>
         </w:rPr>
@@ -132,12 +132,12 @@
     </w:p>
     <w:p>
       <w:pPr>
-        <w:spacing w:after="120"/>
-        <w:jc w:val="left"/>
-      </w:pPr>
-      <w:r>
-        <w:rPr>
-          <w:rFonts w:ascii="Helvetica" w:cs="Helvetica" w:eastAsia="Helvetica" w:hAnsi="Helvetica"/>
+        <w:spacing w:after="110"/>
+        <w:jc w:val="left"/>
+      </w:pPr>
+      <w:r>
+        <w:rPr>
+          <w:rFonts w:ascii="Calibri" w:cs="Calibri" w:eastAsia="Calibri" w:hAnsi="Calibri"/>
           <w:sz w:val="22"/>
           <w:szCs w:val="22"/>
         </w:rPr>
@@ -151,21 +151,21 @@
       </w:pPr>
       <w:r>
         <w:rPr>
-          <w:rFonts w:ascii="Helvetica" w:cs="Helvetica" w:eastAsia="Helvetica" w:hAnsi="Helvetica"/>
-          <w:sz w:val="22"/>
-          <w:szCs w:val="22"/>
-        </w:rPr>
-        <w:t xml:space="preserve"/>
-      </w:r>
-    </w:p>
-    <w:p>
-      <w:pPr>
-        <w:spacing w:after="120"/>
-        <w:jc w:val="left"/>
-      </w:pPr>
-      <w:r>
-        <w:rPr>
-          <w:rFonts w:ascii="Helvetica" w:cs="Helvetica" w:eastAsia="Helvetica" w:hAnsi="Helvetica"/>
+          <w:rFonts w:ascii="Calibri" w:cs="Calibri" w:eastAsia="Calibri" w:hAnsi="Calibri"/>
+          <w:sz w:val="22"/>
+          <w:szCs w:val="22"/>
+        </w:rPr>
+        <w:t xml:space="preserve"/>
+      </w:r>
+    </w:p>
+    <w:p>
+      <w:pPr>
+        <w:spacing w:after="110"/>
+        <w:jc w:val="left"/>
+      </w:pPr>
+      <w:r>
+        <w:rPr>
+          <w:rFonts w:ascii="Calibri" w:cs="Calibri" w:eastAsia="Calibri" w:hAnsi="Calibri"/>
           <w:sz w:val="22"/>
           <w:szCs w:val="22"/>
         </w:rPr>
@@ -179,21 +179,21 @@
       </w:pPr>
       <w:r>
         <w:rPr>
-          <w:rFonts w:ascii="Helvetica" w:cs="Helvetica" w:eastAsia="Helvetica" w:hAnsi="Helvetica"/>
-          <w:sz w:val="22"/>
-          <w:szCs w:val="22"/>
-        </w:rPr>
-        <w:t xml:space="preserve"/>
-      </w:r>
-    </w:p>
-    <w:p>
-      <w:pPr>
-        <w:spacing w:after="120"/>
-        <w:jc w:val="left"/>
-      </w:pPr>
-      <w:r>
-        <w:rPr>
-          <w:rFonts w:ascii="Helvetica" w:cs="Helvetica" w:eastAsia="Helvetica" w:hAnsi="Helvetica"/>
+          <w:rFonts w:ascii="Calibri" w:cs="Calibri" w:eastAsia="Calibri" w:hAnsi="Calibri"/>
+          <w:sz w:val="22"/>
+          <w:szCs w:val="22"/>
+        </w:rPr>
+        <w:t xml:space="preserve"/>
+      </w:r>
+    </w:p>
+    <w:p>
+      <w:pPr>
+        <w:spacing w:after="110"/>
+        <w:jc w:val="left"/>
+      </w:pPr>
+      <w:r>
+        <w:rPr>
+          <w:rFonts w:ascii="Calibri" w:cs="Calibri" w:eastAsia="Calibri" w:hAnsi="Calibri"/>
           <w:sz w:val="22"/>
           <w:szCs w:val="22"/>
         </w:rPr>
@@ -207,161 +207,161 @@
       </w:pPr>
       <w:r>
         <w:rPr>
-          <w:rFonts w:ascii="Helvetica" w:cs="Helvetica" w:eastAsia="Helvetica" w:hAnsi="Helvetica"/>
-          <w:sz w:val="22"/>
-          <w:szCs w:val="22"/>
-        </w:rPr>
-        <w:t xml:space="preserve"/>
-      </w:r>
-    </w:p>
-    <w:p>
-      <w:pPr>
-        <w:spacing w:after="120"/>
+          <w:rFonts w:ascii="Calibri" w:cs="Calibri" w:eastAsia="Calibri" w:hAnsi="Calibri"/>
+          <w:sz w:val="22"/>
+          <w:szCs w:val="22"/>
+        </w:rPr>
+        <w:t xml:space="preserve"/>
+      </w:r>
+    </w:p>
+    <w:p>
+      <w:pPr>
+        <w:spacing w:after="110"/>
+        <w:jc w:val="left"/>
+      </w:pPr>
+      <w:r>
+        <w:rPr>
+          <w:rFonts w:ascii="Calibri" w:cs="Calibri" w:eastAsia="Calibri" w:hAnsi="Calibri"/>
+          <w:sz w:val="22"/>
+          <w:szCs w:val="22"/>
+        </w:rPr>
+        <w:t xml:space="preserve">Sehr geehrte Damen und Herren,</w:t>
+      </w:r>
+    </w:p>
+    <w:p>
+      <w:pPr>
+        <w:spacing w:after="80"/>
+        <w:jc w:val="left"/>
+      </w:pPr>
+      <w:r>
+        <w:rPr>
+          <w:rFonts w:ascii="Calibri" w:cs="Calibri" w:eastAsia="Calibri" w:hAnsi="Calibri"/>
+          <w:sz w:val="22"/>
+          <w:szCs w:val="22"/>
+        </w:rPr>
+        <w:t xml:space="preserve"/>
+      </w:r>
+    </w:p>
+    <w:p>
+      <w:pPr>
+        <w:spacing w:after="110"/>
         <w:jc w:val="both"/>
       </w:pPr>
       <w:r>
         <w:rPr>
-          <w:rFonts w:ascii="Helvetica" w:cs="Helvetica" w:eastAsia="Helvetica" w:hAnsi="Helvetica"/>
-          <w:sz w:val="22"/>
-          <w:szCs w:val="22"/>
-        </w:rPr>
-        <w:t xml:space="preserve">Sehr geehrte Damen und Herren,</w:t>
-      </w:r>
-    </w:p>
-    <w:p>
-      <w:pPr>
-        <w:spacing w:after="80"/>
-        <w:jc w:val="left"/>
-      </w:pPr>
-      <w:r>
-        <w:rPr>
-          <w:rFonts w:ascii="Helvetica" w:cs="Helvetica" w:eastAsia="Helvetica" w:hAnsi="Helvetica"/>
-          <w:sz w:val="22"/>
-          <w:szCs w:val="22"/>
-        </w:rPr>
-        <w:t xml:space="preserve"/>
-      </w:r>
-    </w:p>
-    <w:p>
-      <w:pPr>
-        <w:spacing w:after="120"/>
+          <w:rFonts w:ascii="Calibri" w:cs="Calibri" w:eastAsia="Calibri" w:hAnsi="Calibri"/>
+          <w:sz w:val="22"/>
+          <w:szCs w:val="22"/>
+        </w:rPr>
+        <w:t xml:space="preserve">seit über acht Jahren entwickle ich skalierbare Web-Applikationen – zuletzt als Senior Software-Entwickler bei der TechVision GmbH, wo ich eine SaaS-Plattform für über 50.000 aktive Nutzer mitverantwortet habe. Als ich die Stellenanzeige von TechCorp Solutions entdeckte, war ich sofort neugierig: Die Kombination aus technischer Tiefe, agiler Arbeitskultur und dem Fokus auf cloudbasierte Infrastruktur deckt sich genau mit dem, worauf ich in meiner nächsten Station setzen möchte.</w:t>
+      </w:r>
+    </w:p>
+    <w:p>
+      <w:pPr>
+        <w:spacing w:after="80"/>
+        <w:jc w:val="left"/>
+      </w:pPr>
+      <w:r>
+        <w:rPr>
+          <w:rFonts w:ascii="Calibri" w:cs="Calibri" w:eastAsia="Calibri" w:hAnsi="Calibri"/>
+          <w:sz w:val="22"/>
+          <w:szCs w:val="22"/>
+        </w:rPr>
+        <w:t xml:space="preserve"/>
+      </w:r>
+    </w:p>
+    <w:p>
+      <w:pPr>
+        <w:spacing w:after="110"/>
         <w:jc w:val="both"/>
       </w:pPr>
       <w:r>
         <w:rPr>
-          <w:rFonts w:ascii="Helvetica" w:cs="Helvetica" w:eastAsia="Helvetica" w:hAnsi="Helvetica"/>
-          <w:sz w:val="22"/>
-          <w:szCs w:val="22"/>
-        </w:rPr>
-        <w:t xml:space="preserve">seit über acht Jahren entwickle ich skalierbare Web-Applikationen – zuletzt als Senior Software-Entwickler bei der TechVision GmbH, wo ich eine SaaS-Plattform für über 50.000 aktive Nutzer mitverantwortet habe. Als ich die Stellenanzeige von TechCorp Solutions entdeckte, war ich sofort neugierig: Die Kombination aus technischer Tiefe, agiler Arbeitskultur und dem Fokus auf cloudbasierte Infrastruktur deckt sich genau mit dem, worauf ich in meiner nächsten Station setzen möchte.</w:t>
-      </w:r>
-    </w:p>
-    <w:p>
-      <w:pPr>
-        <w:spacing w:after="80"/>
-        <w:jc w:val="left"/>
-      </w:pPr>
-      <w:r>
-        <w:rPr>
-          <w:rFonts w:ascii="Helvetica" w:cs="Helvetica" w:eastAsia="Helvetica" w:hAnsi="Helvetica"/>
-          <w:sz w:val="22"/>
-          <w:szCs w:val="22"/>
-        </w:rPr>
-        <w:t xml:space="preserve"/>
-      </w:r>
-    </w:p>
-    <w:p>
-      <w:pPr>
-        <w:spacing w:after="120"/>
+          <w:rFonts w:ascii="Calibri" w:cs="Calibri" w:eastAsia="Calibri" w:hAnsi="Calibri"/>
+          <w:sz w:val="22"/>
+          <w:szCs w:val="22"/>
+        </w:rPr>
+        <w:t xml:space="preserve">In meiner aktuellen Rolle habe ich CI/CD-Pipelines mit GitHub Actions eingeführt, die Deployment-Zeiten um 60 Prozent verkürzt haben. Parallel dazu habe ich drei Junior-Entwickler begleitet und ihnen nicht nur technische, sondern auch kommunikative Kompetenzen für die tägliche Zusammenarbeit im Team vermittelt. Ich weiß, dass gute Software selten aus Einzelleistungen entsteht – sie wächst aus geteiltem Wissen und gemeinsamer Verantwortung.</w:t>
+      </w:r>
+    </w:p>
+    <w:p>
+      <w:pPr>
+        <w:spacing w:after="80"/>
+        <w:jc w:val="left"/>
+      </w:pPr>
+      <w:r>
+        <w:rPr>
+          <w:rFonts w:ascii="Calibri" w:cs="Calibri" w:eastAsia="Calibri" w:hAnsi="Calibri"/>
+          <w:sz w:val="22"/>
+          <w:szCs w:val="22"/>
+        </w:rPr>
+        <w:t xml:space="preserve"/>
+      </w:r>
+    </w:p>
+    <w:p>
+      <w:pPr>
+        <w:spacing w:after="110"/>
         <w:jc w:val="both"/>
       </w:pPr>
       <w:r>
         <w:rPr>
-          <w:rFonts w:ascii="Helvetica" w:cs="Helvetica" w:eastAsia="Helvetica" w:hAnsi="Helvetica"/>
-          <w:sz w:val="22"/>
-          <w:szCs w:val="22"/>
-        </w:rPr>
-        <w:t xml:space="preserve">In meiner aktuellen Rolle habe ich CI/CD-Pipelines mit GitHub Actions eingeführt, die Deployment-Zeiten um 60 Prozent verkürzt haben. Parallel dazu habe ich drei Junior-Entwickler begleitet und ihnen nicht nur technische, sondern auch kommunikative Kompetenzen für die tägliche Zusammenarbeit im Team vermittelt. Ich weiß, dass gute Software selten aus Einzelleistungen entsteht – sie wächst aus geteiltem Wissen und gemeinsamer Verantwortung.</w:t>
-      </w:r>
-    </w:p>
-    <w:p>
-      <w:pPr>
-        <w:spacing w:after="80"/>
-        <w:jc w:val="left"/>
-      </w:pPr>
-      <w:r>
-        <w:rPr>
-          <w:rFonts w:ascii="Helvetica" w:cs="Helvetica" w:eastAsia="Helvetica" w:hAnsi="Helvetica"/>
-          <w:sz w:val="22"/>
-          <w:szCs w:val="22"/>
-        </w:rPr>
-        <w:t xml:space="preserve"/>
-      </w:r>
-    </w:p>
-    <w:p>
-      <w:pPr>
-        <w:spacing w:after="120"/>
+          <w:rFonts w:ascii="Calibri" w:cs="Calibri" w:eastAsia="Calibri" w:hAnsi="Calibri"/>
+          <w:sz w:val="22"/>
+          <w:szCs w:val="22"/>
+        </w:rPr>
+        <w:t xml:space="preserve">Was mich an TechCorp Solutions besonders anspricht, ist Ihr öffentlich kommunizierter Anspruch, Technologieentscheidungen transparent und ingenieurgetrieben zu treffen. Das erlebe ich in vielen Unternehmen als Seltenheit und schätze es entsprechend.</w:t>
+      </w:r>
+    </w:p>
+    <w:p>
+      <w:pPr>
+        <w:spacing w:after="80"/>
+        <w:jc w:val="left"/>
+      </w:pPr>
+      <w:r>
+        <w:rPr>
+          <w:rFonts w:ascii="Calibri" w:cs="Calibri" w:eastAsia="Calibri" w:hAnsi="Calibri"/>
+          <w:sz w:val="22"/>
+          <w:szCs w:val="22"/>
+        </w:rPr>
+        <w:t xml:space="preserve"/>
+      </w:r>
+    </w:p>
+    <w:p>
+      <w:pPr>
+        <w:spacing w:after="110"/>
         <w:jc w:val="both"/>
       </w:pPr>
       <w:r>
         <w:rPr>
-          <w:rFonts w:ascii="Helvetica" w:cs="Helvetica" w:eastAsia="Helvetica" w:hAnsi="Helvetica"/>
-          <w:sz w:val="22"/>
-          <w:szCs w:val="22"/>
-        </w:rPr>
-        <w:t xml:space="preserve">Was mich an TechCorp Solutions besonders anspricht, ist Ihr öffentlich kommunizierter Anspruch, Technologieentscheidungen transparent und ingenieurgetrieben zu treffen. Das erlebe ich in vielen Unternehmen als Seltenheit und schätze es entsprechend.</w:t>
-      </w:r>
-    </w:p>
-    <w:p>
-      <w:pPr>
-        <w:spacing w:after="80"/>
-        <w:jc w:val="left"/>
-      </w:pPr>
-      <w:r>
-        <w:rPr>
-          <w:rFonts w:ascii="Helvetica" w:cs="Helvetica" w:eastAsia="Helvetica" w:hAnsi="Helvetica"/>
-          <w:sz w:val="22"/>
-          <w:szCs w:val="22"/>
-        </w:rPr>
-        <w:t xml:space="preserve"/>
-      </w:r>
-    </w:p>
-    <w:p>
-      <w:pPr>
-        <w:spacing w:after="120"/>
+          <w:rFonts w:ascii="Calibri" w:cs="Calibri" w:eastAsia="Calibri" w:hAnsi="Calibri"/>
+          <w:sz w:val="22"/>
+          <w:szCs w:val="22"/>
+        </w:rPr>
+        <w:t xml:space="preserve">Ich bringe fundierte Kenntnisse in TypeScript, React, Node.js und PostgreSQL mit, bin vertraut mit Kubernetes und AWS und habe Erfahrung in der Arbeit nach Scrum in cross-funktionalen Teams. Englisch setze ich täglich auf Verhandlungsniveau ein.</w:t>
+      </w:r>
+    </w:p>
+    <w:p>
+      <w:pPr>
+        <w:spacing w:after="80"/>
+        <w:jc w:val="left"/>
+      </w:pPr>
+      <w:r>
+        <w:rPr>
+          <w:rFonts w:ascii="Calibri" w:cs="Calibri" w:eastAsia="Calibri" w:hAnsi="Calibri"/>
+          <w:sz w:val="22"/>
+          <w:szCs w:val="22"/>
+        </w:rPr>
+        <w:t xml:space="preserve"/>
+      </w:r>
+    </w:p>
+    <w:p>
+      <w:pPr>
+        <w:spacing w:after="110"/>
         <w:jc w:val="both"/>
       </w:pPr>
       <w:r>
         <w:rPr>
-          <w:rFonts w:ascii="Helvetica" w:cs="Helvetica" w:eastAsia="Helvetica" w:hAnsi="Helvetica"/>
-          <w:sz w:val="22"/>
-          <w:szCs w:val="22"/>
-        </w:rPr>
-        <w:t xml:space="preserve">Ich bringe fundierte Kenntnisse in TypeScript, React, Node.js und PostgreSQL mit, bin vertraut mit Kubernetes und AWS und habe Erfahrung in der Arbeit nach Scrum in cross-funktionalen Teams. Englisch setze ich täglich auf Verhandlungsniveau ein.</w:t>
-      </w:r>
-    </w:p>
-    <w:p>
-      <w:pPr>
-        <w:spacing w:after="80"/>
-        <w:jc w:val="left"/>
-      </w:pPr>
-      <w:r>
-        <w:rPr>
-          <w:rFonts w:ascii="Helvetica" w:cs="Helvetica" w:eastAsia="Helvetica" w:hAnsi="Helvetica"/>
-          <w:sz w:val="22"/>
-          <w:szCs w:val="22"/>
-        </w:rPr>
-        <w:t xml:space="preserve"/>
-      </w:r>
-    </w:p>
-    <w:p>
-      <w:pPr>
-        <w:spacing w:after="120"/>
-        <w:jc w:val="both"/>
-      </w:pPr>
-      <w:r>
-        <w:rPr>
-          <w:rFonts w:ascii="Helvetica" w:cs="Helvetica" w:eastAsia="Helvetica" w:hAnsi="Helvetica"/>
+          <w:rFonts w:ascii="Calibri" w:cs="Calibri" w:eastAsia="Calibri" w:hAnsi="Calibri"/>
           <w:sz w:val="22"/>
           <w:szCs w:val="22"/>
         </w:rPr>
@@ -375,21 +375,21 @@
       </w:pPr>
       <w:r>
         <w:rPr>
-          <w:rFonts w:ascii="Helvetica" w:cs="Helvetica" w:eastAsia="Helvetica" w:hAnsi="Helvetica"/>
-          <w:sz w:val="22"/>
-          <w:szCs w:val="22"/>
-        </w:rPr>
-        <w:t xml:space="preserve"/>
-      </w:r>
-    </w:p>
-    <w:p>
-      <w:pPr>
-        <w:spacing w:after="120"/>
-        <w:jc w:val="left"/>
-      </w:pPr>
-      <w:r>
-        <w:rPr>
-          <w:rFonts w:ascii="Helvetica" w:cs="Helvetica" w:eastAsia="Helvetica" w:hAnsi="Helvetica"/>
+          <w:rFonts w:ascii="Calibri" w:cs="Calibri" w:eastAsia="Calibri" w:hAnsi="Calibri"/>
+          <w:sz w:val="22"/>
+          <w:szCs w:val="22"/>
+        </w:rPr>
+        <w:t xml:space="preserve"/>
+      </w:r>
+    </w:p>
+    <w:p>
+      <w:pPr>
+        <w:spacing w:after="110"/>
+        <w:jc w:val="left"/>
+      </w:pPr>
+      <w:r>
+        <w:rPr>
+          <w:rFonts w:ascii="Calibri" w:cs="Calibri" w:eastAsia="Calibri" w:hAnsi="Calibri"/>
           <w:sz w:val="22"/>
           <w:szCs w:val="22"/>
         </w:rPr>
@@ -403,21 +403,21 @@
       </w:pPr>
       <w:r>
         <w:rPr>
-          <w:rFonts w:ascii="Helvetica" w:cs="Helvetica" w:eastAsia="Helvetica" w:hAnsi="Helvetica"/>
-          <w:sz w:val="22"/>
-          <w:szCs w:val="22"/>
-        </w:rPr>
-        <w:t xml:space="preserve"/>
-      </w:r>
-    </w:p>
-    <w:p>
-      <w:pPr>
-        <w:spacing w:after="120"/>
-        <w:jc w:val="left"/>
-      </w:pPr>
-      <w:r>
-        <w:rPr>
-          <w:rFonts w:ascii="Helvetica" w:cs="Helvetica" w:eastAsia="Helvetica" w:hAnsi="Helvetica"/>
+          <w:rFonts w:ascii="Calibri" w:cs="Calibri" w:eastAsia="Calibri" w:hAnsi="Calibri"/>
+          <w:sz w:val="22"/>
+          <w:szCs w:val="22"/>
+        </w:rPr>
+        <w:t xml:space="preserve"/>
+      </w:r>
+    </w:p>
+    <w:p>
+      <w:pPr>
+        <w:spacing w:after="110"/>
+        <w:jc w:val="left"/>
+      </w:pPr>
+      <w:r>
+        <w:rPr>
+          <w:rFonts w:ascii="Calibri" w:cs="Calibri" w:eastAsia="Calibri" w:hAnsi="Calibri"/>
           <w:sz w:val="22"/>
           <w:szCs w:val="22"/>
         </w:rPr>
@@ -426,7 +426,7 @@
     </w:p>
     <w:sectPr>
       <w:pgSz w:w="11906" w:h="16838" w:orient="portrait"/>
-      <w:pgMar w:top="800" w:right="900" w:bottom="800" w:left="900" w:header="708" w:footer="708" w:gutter="0"/>
+      <w:pgMar w:top="720" w:right="900" w:bottom="720" w:left="900" w:header="708" w:footer="708" w:gutter="0"/>
       <w:pgNumType/>
       <w:docGrid w:linePitch="360"/>
     </w:sectPr>

</xml_diff>